<commit_message>
feat: implementa pasaje de parámetros mediante objeto Session - Creación de proyecto 'Practica_Session' con arquitectura de Master Page. - Implementación de guardado de datos en el servidor mediante Session["clave"] en Cursos.aspx. - Recuperación de datos en DetalleCurso.aspx aplicando casting obligatorio de (string). - Validación de nulos para prevenir excepciones en el ciclo de vida de la página. - Mejora de la privacidad de datos al evitar el uso de QueryString para información interna.
</commit_message>
<xml_diff>
--- a/Documentación teórica.docx
+++ b/Documentación teórica.docx
@@ -8,17 +8,8 @@
           <w:b/>
           <w:bCs/>
         </w:rPr>
-        <w:t xml:space="preserve">TEMA: Introducción a ASP.NET y </w:t>
-      </w:r>
-      <w:proofErr w:type="spellStart"/>
-      <w:r>
-        <w:rPr>
-          <w:b/>
-          <w:bCs/>
-        </w:rPr>
-        <w:t>WebForms</w:t>
-      </w:r>
-      <w:proofErr w:type="spellEnd"/>
+        <w:t>TEMA: Introducción a ASP.NET y WebForms</w:t>
+      </w:r>
     </w:p>
     <w:p>
       <w:r>
@@ -68,23 +59,7 @@
         <w:t>ASP.NET:</w:t>
       </w:r>
       <w:r>
-        <w:t xml:space="preserve"> Es un </w:t>
-      </w:r>
-      <w:proofErr w:type="spellStart"/>
-      <w:r>
-        <w:t>framework</w:t>
-      </w:r>
-      <w:proofErr w:type="spellEnd"/>
-      <w:r>
-        <w:t xml:space="preserve"> de Microsoft diseñado para la creación de aplicaciones web dinámicas, permitiendo utilizar C# como lenguaje de servidor (Back-</w:t>
-      </w:r>
-      <w:proofErr w:type="spellStart"/>
-      <w:r>
-        <w:t>end</w:t>
-      </w:r>
-      <w:proofErr w:type="spellEnd"/>
-      <w:r>
-        <w:t>).</w:t>
+        <w:t xml:space="preserve"> Es un framework de Microsoft diseñado para la creación de aplicaciones web dinámicas, permitiendo utilizar C# como lenguaje de servidor (Back-end).</w:t>
       </w:r>
     </w:p>
     <w:p>
@@ -94,21 +69,12 @@
           <w:numId w:val="1"/>
         </w:numPr>
       </w:pPr>
-      <w:proofErr w:type="spellStart"/>
-      <w:r>
-        <w:rPr>
-          <w:b/>
-          <w:bCs/>
-        </w:rPr>
-        <w:t>WebForms</w:t>
-      </w:r>
-      <w:proofErr w:type="spellEnd"/>
-      <w:r>
-        <w:rPr>
-          <w:b/>
-          <w:bCs/>
-        </w:rPr>
-        <w:t>:</w:t>
+      <w:r>
+        <w:rPr>
+          <w:b/>
+          <w:bCs/>
+        </w:rPr>
+        <w:t>WebForms:</w:t>
       </w:r>
       <w:r>
         <w:t xml:space="preserve"> Es uno de los modelos de desarrollo dentro de ASP.NET. Su arquitectura busca simular la experiencia de programación de aplicaciones de escritorio (WinForms) en un entorno web.</w:t>
@@ -129,15 +95,7 @@
         <w:t>Ventajas:</w:t>
       </w:r>
       <w:r>
-        <w:t xml:space="preserve"> Permite una rápida adaptación gracias a su sistema de "arrastrar y soltar" controles y su programación basada en eventos (ej. </w:t>
-      </w:r>
-      <w:proofErr w:type="spellStart"/>
-      <w:r>
-        <w:t>OnClick</w:t>
-      </w:r>
-      <w:proofErr w:type="spellEnd"/>
-      <w:r>
-        <w:t>).</w:t>
+        <w:t xml:space="preserve"> Permite una rápida adaptación gracias a su sistema de "arrastrar y soltar" controles y su programación basada en eventos (ej. OnClick).</w:t>
       </w:r>
     </w:p>
     <w:p>
@@ -155,34 +113,17 @@
         <w:t>Funcionamiento (ASPX vs HTML):</w:t>
       </w:r>
       <w:r>
-        <w:t xml:space="preserve"> El código se escribe en archivos .</w:t>
-      </w:r>
-      <w:proofErr w:type="spellStart"/>
-      <w:r>
-        <w:t>aspx</w:t>
-      </w:r>
-      <w:proofErr w:type="spellEnd"/>
-      <w:r>
-        <w:t>. Cuando un usuario solicita la página, el servidor ejecuta la lógica en C#, renderiza el resultado y envía únicamente código HTML, CSS y JS estándar al navegador del cliente, manteniendo el código fuente C# seguro y oculto en el servidor.</w:t>
-      </w:r>
-    </w:p>
-    <w:p>
-      <w:r>
-        <w:rPr>
-          <w:b/>
-          <w:bCs/>
-        </w:rPr>
-        <w:t xml:space="preserve">TEMA: Diferencia entre HTML y ASPX en ASP.NET </w:t>
-      </w:r>
-      <w:proofErr w:type="spellStart"/>
-      <w:r>
-        <w:rPr>
-          <w:b/>
-          <w:bCs/>
-        </w:rPr>
-        <w:t>WebForms</w:t>
-      </w:r>
-      <w:proofErr w:type="spellEnd"/>
+        <w:t xml:space="preserve"> El código se escribe en archivos .aspx. Cuando un usuario solicita la página, el servidor ejecuta la lógica en C#, renderiza el resultado y envía únicamente código HTML, CSS y JS estándar al navegador del cliente, manteniendo el código fuente C# seguro y oculto en el servidor.</w:t>
+      </w:r>
+    </w:p>
+    <w:p>
+      <w:r>
+        <w:rPr>
+          <w:b/>
+          <w:bCs/>
+        </w:rPr>
+        <w:t>TEMA: Diferencia entre HTML y ASPX en ASP.NET WebForms</w:t>
+      </w:r>
     </w:p>
     <w:p>
       <w:r>
@@ -202,55 +143,7 @@
           <w:b/>
           <w:bCs/>
         </w:rPr>
-        <w:t>HTML (</w:t>
-      </w:r>
-      <w:proofErr w:type="spellStart"/>
-      <w:r>
-        <w:rPr>
-          <w:b/>
-          <w:bCs/>
-        </w:rPr>
-        <w:t>HyperText</w:t>
-      </w:r>
-      <w:proofErr w:type="spellEnd"/>
-      <w:r>
-        <w:rPr>
-          <w:b/>
-          <w:bCs/>
-        </w:rPr>
-        <w:t xml:space="preserve"> </w:t>
-      </w:r>
-      <w:proofErr w:type="spellStart"/>
-      <w:r>
-        <w:rPr>
-          <w:b/>
-          <w:bCs/>
-        </w:rPr>
-        <w:t>Markup</w:t>
-      </w:r>
-      <w:proofErr w:type="spellEnd"/>
-      <w:r>
-        <w:rPr>
-          <w:b/>
-          <w:bCs/>
-        </w:rPr>
-        <w:t xml:space="preserve"> </w:t>
-      </w:r>
-      <w:proofErr w:type="spellStart"/>
-      <w:r>
-        <w:rPr>
-          <w:b/>
-          <w:bCs/>
-        </w:rPr>
-        <w:t>Language</w:t>
-      </w:r>
-      <w:proofErr w:type="spellEnd"/>
-      <w:r>
-        <w:rPr>
-          <w:b/>
-          <w:bCs/>
-        </w:rPr>
-        <w:t>):</w:t>
+        <w:t>HTML (HyperText Markup Language):</w:t>
       </w:r>
     </w:p>
     <w:p>
@@ -286,15 +179,7 @@
         <w:t>Procesamiento:</w:t>
       </w:r>
       <w:r>
-        <w:t xml:space="preserve"> Se ejecuta del lado del cliente (Front-</w:t>
-      </w:r>
-      <w:proofErr w:type="spellStart"/>
-      <w:r>
-        <w:t>end</w:t>
-      </w:r>
-      <w:proofErr w:type="spellEnd"/>
-      <w:r>
-        <w:t>). El navegador web lo lee y lo interpreta directamente.</w:t>
+        <w:t xml:space="preserve"> Se ejecuta del lado del cliente (Front-end). El navegador web lo lee y lo interpreta directamente.</w:t>
       </w:r>
     </w:p>
     <w:p>
@@ -345,15 +230,7 @@
         <w:t>Naturaleza:</w:t>
       </w:r>
       <w:r>
-        <w:t xml:space="preserve"> Es un formato de archivo dinámico propio de ASP.NET </w:t>
-      </w:r>
-      <w:proofErr w:type="spellStart"/>
-      <w:r>
-        <w:t>WebForms</w:t>
-      </w:r>
-      <w:proofErr w:type="spellEnd"/>
-      <w:r>
-        <w:t>.</w:t>
+        <w:t xml:space="preserve"> Es un formato de archivo dinámico propio de ASP.NET WebForms.</w:t>
       </w:r>
     </w:p>
     <w:p>
@@ -371,28 +248,7 @@
         <w:t>Composición:</w:t>
       </w:r>
       <w:r>
-        <w:t xml:space="preserve"> Permite combinar marcado estándar (HTML) con controles de servidor de ASP.NET (etiquetas con el prefijo &lt;</w:t>
-      </w:r>
-      <w:proofErr w:type="spellStart"/>
-      <w:proofErr w:type="gramStart"/>
-      <w:r>
-        <w:t>asp</w:t>
-      </w:r>
-      <w:proofErr w:type="spellEnd"/>
-      <w:r>
-        <w:t>:...</w:t>
-      </w:r>
-      <w:proofErr w:type="gramEnd"/>
-      <w:r>
-        <w:t>&gt;) y directivas que lo enlazan con código C# (el archivo de "</w:t>
-      </w:r>
-      <w:proofErr w:type="spellStart"/>
-      <w:r>
-        <w:t>Code-Behind</w:t>
-      </w:r>
-      <w:proofErr w:type="spellEnd"/>
-      <w:r>
-        <w:t>").</w:t>
+        <w:t xml:space="preserve"> Permite combinar marcado estándar (HTML) con controles de servidor de ASP.NET (etiquetas con el prefijo &lt;asp:...&gt;) y directivas que lo enlazan con código C# (el archivo de "Code-Behind").</w:t>
       </w:r>
     </w:p>
     <w:p>
@@ -410,15 +266,7 @@
         <w:t>Procesamiento:</w:t>
       </w:r>
       <w:r>
-        <w:t xml:space="preserve"> Se ejecuta del lado del servidor (Back-</w:t>
-      </w:r>
-      <w:proofErr w:type="spellStart"/>
-      <w:r>
-        <w:t>end</w:t>
-      </w:r>
-      <w:proofErr w:type="spellEnd"/>
-      <w:r>
-        <w:t xml:space="preserve">). Cuando se solicita la página, el servidor (IIS) procesa el código C# y los controles ASPX, genera un documento HTML estándar al vuelo y envía </w:t>
+        <w:t xml:space="preserve"> Se ejecuta del lado del servidor (Back-end). Cuando se solicita la página, el servidor (IIS) procesa el código C# y los controles ASPX, genera un documento HTML estándar al vuelo y envía </w:t>
       </w:r>
       <w:r>
         <w:rPr>
@@ -464,17 +312,8 @@
           <w:bCs/>
         </w:rPr>
         <w:lastRenderedPageBreak/>
-        <w:t xml:space="preserve">TEMA: Master Pages en ASP.NET </w:t>
-      </w:r>
-      <w:proofErr w:type="spellStart"/>
-      <w:r>
-        <w:rPr>
-          <w:b/>
-          <w:bCs/>
-        </w:rPr>
-        <w:t>WebForms</w:t>
-      </w:r>
-      <w:proofErr w:type="spellEnd"/>
+        <w:t>TEMA: Master Pages en ASP.NET WebForms</w:t>
+      </w:r>
     </w:p>
     <w:p>
       <w:r>
@@ -509,23 +348,7 @@
           <w:b/>
           <w:bCs/>
         </w:rPr>
-        <w:t xml:space="preserve">Master Page </w:t>
-      </w:r>
-      <w:proofErr w:type="gramStart"/>
-      <w:r>
-        <w:rPr>
-          <w:b/>
-          <w:bCs/>
-        </w:rPr>
-        <w:t>(.Master</w:t>
-      </w:r>
-      <w:proofErr w:type="gramEnd"/>
-      <w:r>
-        <w:rPr>
-          <w:b/>
-          <w:bCs/>
-        </w:rPr>
-        <w:t>):</w:t>
+        <w:t>Master Page (.Master):</w:t>
       </w:r>
       <w:r>
         <w:t xml:space="preserve"> Es una plantilla principal que define el diseño estructurado y los elementos comunes de la interfaz de usuario (como encabezados, menús de navegación y pies de página) que se repetirán en todo el sitio web.</w:t>
@@ -538,21 +361,12 @@
           <w:numId w:val="4"/>
         </w:numPr>
       </w:pPr>
-      <w:proofErr w:type="spellStart"/>
-      <w:r>
-        <w:rPr>
-          <w:b/>
-          <w:bCs/>
-        </w:rPr>
-        <w:t>ContentPlaceHolder</w:t>
-      </w:r>
-      <w:proofErr w:type="spellEnd"/>
-      <w:r>
-        <w:rPr>
-          <w:b/>
-          <w:bCs/>
-        </w:rPr>
-        <w:t>:</w:t>
+      <w:r>
+        <w:rPr>
+          <w:b/>
+          <w:bCs/>
+        </w:rPr>
+        <w:t>ContentPlaceHolder:</w:t>
       </w:r>
       <w:r>
         <w:t xml:space="preserve"> Es un control de servidor que se ubica dentro de la Master Page. Actúa como un contenedor o "hueco" donde se inyectará dinámicamente el contenido específico de cada página individual.</w:t>
@@ -570,60 +384,10 @@
           <w:b/>
           <w:bCs/>
         </w:rPr>
-        <w:t>Content Page (.</w:t>
-      </w:r>
-      <w:proofErr w:type="spellStart"/>
-      <w:r>
-        <w:rPr>
-          <w:b/>
-          <w:bCs/>
-        </w:rPr>
-        <w:t>aspx</w:t>
-      </w:r>
-      <w:proofErr w:type="spellEnd"/>
-      <w:r>
-        <w:rPr>
-          <w:b/>
-          <w:bCs/>
-        </w:rPr>
-        <w:t>):</w:t>
-      </w:r>
-      <w:r>
-        <w:t xml:space="preserve"> Son las páginas web individuales que heredarán el diseño de la Master Page. En lugar de contener etiquetas HTML estructurales (&lt;</w:t>
-      </w:r>
-      <w:proofErr w:type="spellStart"/>
-      <w:r>
-        <w:t>html</w:t>
-      </w:r>
-      <w:proofErr w:type="spellEnd"/>
-      <w:r>
-        <w:t>&gt;, &lt;</w:t>
-      </w:r>
-      <w:proofErr w:type="spellStart"/>
-      <w:r>
-        <w:t>body</w:t>
-      </w:r>
-      <w:proofErr w:type="spellEnd"/>
-      <w:r>
-        <w:t>&gt;), estas páginas utilizan un control &lt;</w:t>
-      </w:r>
-      <w:proofErr w:type="spellStart"/>
-      <w:proofErr w:type="gramStart"/>
-      <w:r>
-        <w:t>asp:Content</w:t>
-      </w:r>
-      <w:proofErr w:type="spellEnd"/>
-      <w:proofErr w:type="gramEnd"/>
-      <w:r>
-        <w:t xml:space="preserve">&gt; que se vincula directamente al </w:t>
-      </w:r>
-      <w:proofErr w:type="spellStart"/>
-      <w:r>
-        <w:t>ContentPlaceHolder</w:t>
-      </w:r>
-      <w:proofErr w:type="spellEnd"/>
-      <w:r>
-        <w:t xml:space="preserve"> de la plantilla principal.</w:t>
+        <w:t>Content Page (.aspx):</w:t>
+      </w:r>
+      <w:r>
+        <w:t xml:space="preserve"> Son las páginas web individuales que heredarán el diseño de la Master Page. En lugar de contener etiquetas HTML estructurales (&lt;html&gt;, &lt;body&gt;), estas páginas utilizan un control &lt;asp:Content&gt; que se vincula directamente al ContentPlaceHolder de la plantilla principal.</w:t>
       </w:r>
     </w:p>
     <w:p>
@@ -650,15 +414,7 @@
         <w:t>Mantenimiento centralizado:</w:t>
       </w:r>
       <w:r>
-        <w:t xml:space="preserve"> Modificar el menú o el pie de página en el </w:t>
-      </w:r>
-      <w:proofErr w:type="gramStart"/>
-      <w:r>
-        <w:t>archivo .Master</w:t>
-      </w:r>
-      <w:proofErr w:type="gramEnd"/>
-      <w:r>
-        <w:t xml:space="preserve"> actualiza automáticamente todas las páginas del sitio que dependan de él.</w:t>
+        <w:t xml:space="preserve"> Modificar el menú o el pie de página en el archivo .Master actualiza automáticamente todas las páginas del sitio que dependan de él.</w:t>
       </w:r>
     </w:p>
     <w:p>
@@ -676,40 +432,16 @@
         <w:t>Código más limpio:</w:t>
       </w:r>
       <w:r>
-        <w:t xml:space="preserve"> Las páginas .</w:t>
-      </w:r>
-      <w:proofErr w:type="spellStart"/>
-      <w:r>
-        <w:t>aspx</w:t>
-      </w:r>
-      <w:proofErr w:type="spellEnd"/>
-      <w:r>
-        <w:t xml:space="preserve"> se vuelven mucho más ligeras y fáciles de leer, ya que solo contienen el código de lo que realmente hacen (su contenido específico).</w:t>
-      </w:r>
-    </w:p>
-    <w:p>
-      <w:r>
-        <w:rPr>
-          <w:b/>
-          <w:bCs/>
-        </w:rPr>
-        <w:t xml:space="preserve">TEMA: Inclusión de archivos y </w:t>
-      </w:r>
-      <w:proofErr w:type="spellStart"/>
-      <w:r>
-        <w:rPr>
-          <w:b/>
-          <w:bCs/>
-        </w:rPr>
-        <w:t>BundleConfig</w:t>
-      </w:r>
-      <w:proofErr w:type="spellEnd"/>
-      <w:r>
-        <w:rPr>
-          <w:b/>
-          <w:bCs/>
-        </w:rPr>
-        <w:t xml:space="preserve"> en ASP.NET</w:t>
+        <w:t xml:space="preserve"> Las páginas .aspx se vuelven mucho más ligeras y fáciles de leer, ya que solo contienen el código de lo que realmente hacen (su contenido específico).</w:t>
+      </w:r>
+    </w:p>
+    <w:p>
+      <w:r>
+        <w:rPr>
+          <w:b/>
+          <w:bCs/>
+        </w:rPr>
+        <w:t>TEMA: Inclusión de archivos y BundleConfig en ASP.NET</w:t>
       </w:r>
     </w:p>
     <w:p>
@@ -758,48 +490,15 @@
           <w:numId w:val="6"/>
         </w:numPr>
       </w:pPr>
-      <w:proofErr w:type="spellStart"/>
-      <w:r>
-        <w:rPr>
-          <w:b/>
-          <w:bCs/>
-        </w:rPr>
-        <w:t>BundleConfig</w:t>
-      </w:r>
-      <w:proofErr w:type="spellEnd"/>
-      <w:r>
-        <w:rPr>
-          <w:b/>
-          <w:bCs/>
-        </w:rPr>
-        <w:t>:</w:t>
-      </w:r>
-      <w:r>
-        <w:t xml:space="preserve"> Es una clase de configuración en ASP.NET utilizada para definir y registrar paquetes ("</w:t>
-      </w:r>
-      <w:proofErr w:type="spellStart"/>
-      <w:r>
-        <w:t>bundles</w:t>
-      </w:r>
-      <w:proofErr w:type="spellEnd"/>
-      <w:r>
-        <w:t xml:space="preserve">") de archivos estáticos. Su objetivo es mejorar el rendimiento de la aplicación mediante dos técnicas: </w:t>
-      </w:r>
-      <w:proofErr w:type="spellStart"/>
-      <w:r>
-        <w:t>Bundling</w:t>
-      </w:r>
-      <w:proofErr w:type="spellEnd"/>
-      <w:r>
-        <w:t xml:space="preserve"> y </w:t>
-      </w:r>
-      <w:proofErr w:type="spellStart"/>
-      <w:r>
-        <w:t>Minification</w:t>
-      </w:r>
-      <w:proofErr w:type="spellEnd"/>
-      <w:r>
-        <w:t>.</w:t>
+      <w:r>
+        <w:rPr>
+          <w:b/>
+          <w:bCs/>
+        </w:rPr>
+        <w:t>BundleConfig:</w:t>
+      </w:r>
+      <w:r>
+        <w:t xml:space="preserve"> Es una clase de configuración en ASP.NET utilizada para definir y registrar paquetes ("bundles") de archivos estáticos. Su objetivo es mejorar el rendimiento de la aplicación mediante dos técnicas: Bundling y Minification.</w:t>
       </w:r>
     </w:p>
     <w:p>
@@ -809,40 +508,15 @@
           <w:numId w:val="6"/>
         </w:numPr>
       </w:pPr>
-      <w:proofErr w:type="spellStart"/>
-      <w:r>
-        <w:rPr>
-          <w:b/>
-          <w:bCs/>
-        </w:rPr>
-        <w:t>Bundling</w:t>
-      </w:r>
-      <w:proofErr w:type="spellEnd"/>
-      <w:r>
-        <w:rPr>
-          <w:b/>
-          <w:bCs/>
-        </w:rPr>
-        <w:t xml:space="preserve"> (Agrupación):</w:t>
-      </w:r>
-      <w:r>
-        <w:t xml:space="preserve"> Proceso que combina múltiples archivos del mismo tipo (ej. varios .</w:t>
-      </w:r>
-      <w:proofErr w:type="spellStart"/>
-      <w:r>
-        <w:t>css</w:t>
-      </w:r>
-      <w:proofErr w:type="spellEnd"/>
-      <w:r>
-        <w:t xml:space="preserve"> o varios .</w:t>
-      </w:r>
-      <w:proofErr w:type="spellStart"/>
-      <w:r>
-        <w:t>js</w:t>
-      </w:r>
-      <w:proofErr w:type="spellEnd"/>
-      <w:r>
-        <w:t>) en un único archivo consolidado. Esto reduce drásticamente la cantidad de peticiones HTTP que debe realizar el navegador.</w:t>
+      <w:r>
+        <w:rPr>
+          <w:b/>
+          <w:bCs/>
+        </w:rPr>
+        <w:t>Bundling (Agrupación):</w:t>
+      </w:r>
+      <w:r>
+        <w:t xml:space="preserve"> Proceso que combina múltiples archivos del mismo tipo (ej. varios .css o varios .js) en un único archivo consolidado. Esto reduce drásticamente la cantidad de peticiones HTTP que debe realizar el navegador.</w:t>
       </w:r>
     </w:p>
     <w:p>
@@ -852,56 +526,15 @@
           <w:numId w:val="6"/>
         </w:numPr>
       </w:pPr>
-      <w:proofErr w:type="spellStart"/>
-      <w:r>
-        <w:rPr>
-          <w:b/>
-          <w:bCs/>
-        </w:rPr>
-        <w:t>Minification</w:t>
-      </w:r>
-      <w:proofErr w:type="spellEnd"/>
-      <w:r>
-        <w:rPr>
-          <w:b/>
-          <w:bCs/>
-        </w:rPr>
-        <w:t xml:space="preserve"> (</w:t>
-      </w:r>
-      <w:proofErr w:type="spellStart"/>
-      <w:r>
-        <w:rPr>
-          <w:b/>
-          <w:bCs/>
-        </w:rPr>
-        <w:t>Minificación</w:t>
-      </w:r>
-      <w:proofErr w:type="spellEnd"/>
-      <w:r>
-        <w:rPr>
-          <w:b/>
-          <w:bCs/>
-        </w:rPr>
-        <w:t>):</w:t>
-      </w:r>
-      <w:r>
-        <w:t xml:space="preserve"> Proceso de compresión que elimina caracteres innecesarios (espacios, saltos de línea, comentarios) y optimiza el código del </w:t>
-      </w:r>
-      <w:proofErr w:type="spellStart"/>
-      <w:r>
-        <w:t>bundle</w:t>
-      </w:r>
-      <w:proofErr w:type="spellEnd"/>
-      <w:r>
-        <w:t xml:space="preserve"> resultante. Esto reduce significativamente el tamaño del archivo en bytes (</w:t>
-      </w:r>
-      <w:proofErr w:type="spellStart"/>
-      <w:r>
-        <w:t>payload</w:t>
-      </w:r>
-      <w:proofErr w:type="spellEnd"/>
-      <w:r>
-        <w:t>) que viaja por la red, acelerando la descarga sin alterar la funcionalidad del código.</w:t>
+      <w:r>
+        <w:rPr>
+          <w:b/>
+          <w:bCs/>
+        </w:rPr>
+        <w:t>Minification (Minificación):</w:t>
+      </w:r>
+      <w:r>
+        <w:t xml:space="preserve"> Proceso de compresión que elimina caracteres innecesarios (espacios, saltos de línea, comentarios) y optimiza el código del bundle resultante. Esto reduce significativamente el tamaño del archivo en bytes (payload) que viaja por la red, acelerando la descarga sin alterar la funcionalidad del código.</w:t>
       </w:r>
     </w:p>
     <w:p/>
@@ -912,17 +545,8 @@
           <w:bCs/>
         </w:rPr>
         <w:lastRenderedPageBreak/>
-        <w:t xml:space="preserve">TEMA: Controles ASP vs Controles HTML en </w:t>
-      </w:r>
-      <w:proofErr w:type="spellStart"/>
-      <w:r>
-        <w:rPr>
-          <w:b/>
-          <w:bCs/>
-        </w:rPr>
-        <w:t>WebForms</w:t>
-      </w:r>
-      <w:proofErr w:type="spellEnd"/>
+        <w:t>TEMA: Controles ASP vs Controles HTML en WebForms</w:t>
+      </w:r>
     </w:p>
     <w:p>
       <w:r>
@@ -933,15 +557,7 @@
         <w:t>Contexto:</w:t>
       </w:r>
       <w:r>
-        <w:t xml:space="preserve"> Elección de los elementos de interfaz de usuario según la necesidad de interacción con el código "</w:t>
-      </w:r>
-      <w:proofErr w:type="spellStart"/>
-      <w:r>
-        <w:t>Code-Behind</w:t>
-      </w:r>
-      <w:proofErr w:type="spellEnd"/>
-      <w:r>
-        <w:t>" (C#) en el servidor.</w:t>
+        <w:t xml:space="preserve"> Elección de los elementos de interfaz de usuario según la necesidad de interacción con el código "Code-Behind" (C#) en el servidor.</w:t>
       </w:r>
     </w:p>
     <w:p>
@@ -968,23 +584,7 @@
         <w:t>Sintaxis:</w:t>
       </w:r>
       <w:r>
-        <w:t xml:space="preserve"> Etiquetas estándar de la web (ej. &lt;input&gt;, &lt;</w:t>
-      </w:r>
-      <w:proofErr w:type="spellStart"/>
-      <w:r>
-        <w:t>button</w:t>
-      </w:r>
-      <w:proofErr w:type="spellEnd"/>
-      <w:r>
-        <w:t>&gt;, &lt;</w:t>
-      </w:r>
-      <w:proofErr w:type="spellStart"/>
-      <w:r>
-        <w:t>div</w:t>
-      </w:r>
-      <w:proofErr w:type="spellEnd"/>
-      <w:r>
-        <w:t>&gt;).</w:t>
+        <w:t xml:space="preserve"> Etiquetas estándar de la web (ej. &lt;input&gt;, &lt;button&gt;, &lt;div&gt;).</w:t>
       </w:r>
     </w:p>
     <w:p>
@@ -1038,15 +638,7 @@
         <w:t>Uso recomendado:</w:t>
       </w:r>
       <w:r>
-        <w:t xml:space="preserve"> Elementos puramente visuales, maquetado estático o elementos que solo interactúan con JavaScript en el Front-</w:t>
-      </w:r>
-      <w:proofErr w:type="spellStart"/>
-      <w:r>
-        <w:t>end</w:t>
-      </w:r>
-      <w:proofErr w:type="spellEnd"/>
-      <w:r>
-        <w:t>. Son más ligeros ya que no requieren procesamiento del servidor.</w:t>
+        <w:t xml:space="preserve"> Elementos puramente visuales, maquetado estático o elementos que solo interactúan con JavaScript en el Front-end. Son más ligeros ya que no requieren procesamiento del servidor.</w:t>
       </w:r>
     </w:p>
     <w:p>
@@ -1073,52 +665,7 @@
         <w:t>Sintaxis:</w:t>
       </w:r>
       <w:r>
-        <w:t xml:space="preserve"> Llevan el prefijo &lt;</w:t>
-      </w:r>
-      <w:proofErr w:type="spellStart"/>
-      <w:proofErr w:type="gramStart"/>
-      <w:r>
-        <w:t>asp</w:t>
-      </w:r>
-      <w:proofErr w:type="spellEnd"/>
-      <w:r>
-        <w:t>:...</w:t>
-      </w:r>
-      <w:proofErr w:type="gramEnd"/>
-      <w:r>
-        <w:t xml:space="preserve">&gt; y obligatoriamente el atributo </w:t>
-      </w:r>
-      <w:proofErr w:type="spellStart"/>
-      <w:r>
-        <w:t>runat</w:t>
-      </w:r>
-      <w:proofErr w:type="spellEnd"/>
-      <w:r>
-        <w:t>="server" (ej. &lt;</w:t>
-      </w:r>
-      <w:proofErr w:type="spellStart"/>
-      <w:r>
-        <w:t>asp:Button</w:t>
-      </w:r>
-      <w:proofErr w:type="spellEnd"/>
-      <w:r>
-        <w:t xml:space="preserve"> ID="</w:t>
-      </w:r>
-      <w:proofErr w:type="spellStart"/>
-      <w:r>
-        <w:t>btnEnviar</w:t>
-      </w:r>
-      <w:proofErr w:type="spellEnd"/>
-      <w:r>
-        <w:t xml:space="preserve">" </w:t>
-      </w:r>
-      <w:proofErr w:type="spellStart"/>
-      <w:r>
-        <w:t>runat</w:t>
-      </w:r>
-      <w:proofErr w:type="spellEnd"/>
-      <w:r>
-        <w:t>="server" /&gt;).</w:t>
+        <w:t xml:space="preserve"> Llevan el prefijo &lt;asp:...&gt; y obligatoriamente el atributo runat="server" (ej. &lt;asp:Button ID="btnEnviar" runat="server" /&gt;).</w:t>
       </w:r>
     </w:p>
     <w:p>
@@ -1136,15 +683,7 @@
         <w:t>Procesamiento:</w:t>
       </w:r>
       <w:r>
-        <w:t xml:space="preserve"> Se procesan en el servidor (Back-</w:t>
-      </w:r>
-      <w:proofErr w:type="spellStart"/>
-      <w:r>
-        <w:t>end</w:t>
-      </w:r>
-      <w:proofErr w:type="spellEnd"/>
-      <w:r>
-        <w:t>) y luego ASP.NET los "renderiza" (traduce) a controles HTML estándar antes de enviarlos al navegador del cliente.</w:t>
+        <w:t xml:space="preserve"> Se procesan en el servidor (Back-end) y luego ASP.NET los "renderiza" (traduce) a controles HTML estándar antes de enviarlos al navegador del cliente.</w:t>
       </w:r>
     </w:p>
     <w:p>
@@ -1162,15 +701,7 @@
         <w:t>Interacción con C#:</w:t>
       </w:r>
       <w:r>
-        <w:t xml:space="preserve"> Total. Permiten programación orientada a eventos (ej. </w:t>
-      </w:r>
-      <w:proofErr w:type="spellStart"/>
-      <w:r>
-        <w:t>OnClick</w:t>
-      </w:r>
-      <w:proofErr w:type="spellEnd"/>
-      <w:r>
-        <w:t>). El programador puede acceder a ellos desde el código C# utilizando su ID para leer datos, modificar su estado, cambiar estilos o conectarlos a bases de datos (como grillas).</w:t>
+        <w:t xml:space="preserve"> Total. Permiten programación orientada a eventos (ej. OnClick). El programador puede acceder a ellos desde el código C# utilizando su ID para leer datos, modificar su estado, cambiar estilos o conectarlos a bases de datos (como grillas).</w:t>
       </w:r>
     </w:p>
     <w:p>
@@ -1191,6 +722,128 @@
         <w:t xml:space="preserve"> Formularios de ingreso de datos, botones que ejecutan lógica de negocio, grillas dinámicas y cualquier elemento que necesite interactuar con la base de datos o el código del servidor.</w:t>
       </w:r>
     </w:p>
+    <w:p>
+      <w:pPr>
+        <w:rPr>
+          <w:b/>
+          <w:bCs/>
+        </w:rPr>
+      </w:pPr>
+      <w:r>
+        <w:rPr>
+          <w:rFonts w:ascii="Segoe UI Emoji" w:hAnsi="Segoe UI Emoji" w:cs="Segoe UI Emoji"/>
+          <w:b/>
+          <w:bCs/>
+        </w:rPr>
+        <w:t>📄</w:t>
+      </w:r>
+      <w:r>
+        <w:rPr>
+          <w:b/>
+          <w:bCs/>
+        </w:rPr>
+        <w:t xml:space="preserve"> El modelo Code-Behind</w:t>
+      </w:r>
+    </w:p>
+    <w:p>
+      <w:r>
+        <w:rPr>
+          <w:i/>
+          <w:iCs/>
+        </w:rPr>
+        <w:t>(Agregá esta nota técnica, te la van a preguntar en la UTN)</w:t>
+      </w:r>
+    </w:p>
+    <w:p>
+      <w:pPr>
+        <w:rPr>
+          <w:lang w:val="en-US"/>
+        </w:rPr>
+      </w:pPr>
+      <w:r>
+        <w:rPr>
+          <w:b/>
+          <w:bCs/>
+          <w:lang w:val="en-US"/>
+        </w:rPr>
+        <w:t>Concepto: Code-Behind en Web Forms</w:t>
+      </w:r>
+    </w:p>
+    <w:p>
+      <w:pPr>
+        <w:numPr>
+          <w:ilvl w:val="0"/>
+          <w:numId w:val="9"/>
+        </w:numPr>
+      </w:pPr>
+      <w:r>
+        <w:rPr>
+          <w:b/>
+          <w:bCs/>
+        </w:rPr>
+        <w:t>Archivo .aspx / .Master</w:t>
+      </w:r>
+      <w:r>
+        <w:t xml:space="preserve">: Contiene el marcado declarativo (HTML + Controles de servidor). Es la </w:t>
+      </w:r>
+      <w:r>
+        <w:rPr>
+          <w:b/>
+          <w:bCs/>
+        </w:rPr>
+        <w:t>Vista</w:t>
+      </w:r>
+      <w:r>
+        <w:t>.</w:t>
+      </w:r>
+    </w:p>
+    <w:p>
+      <w:pPr>
+        <w:numPr>
+          <w:ilvl w:val="0"/>
+          <w:numId w:val="9"/>
+        </w:numPr>
+      </w:pPr>
+      <w:r>
+        <w:rPr>
+          <w:b/>
+          <w:bCs/>
+        </w:rPr>
+        <w:t>Archivo .cs</w:t>
+      </w:r>
+      <w:r>
+        <w:t xml:space="preserve">: Contiene el código en C# que maneja los eventos de la página. Es el </w:t>
+      </w:r>
+      <w:r>
+        <w:rPr>
+          <w:b/>
+          <w:bCs/>
+        </w:rPr>
+        <w:t>Controlador</w:t>
+      </w:r>
+      <w:r>
+        <w:t xml:space="preserve"> de la lógica.</w:t>
+      </w:r>
+    </w:p>
+    <w:p>
+      <w:pPr>
+        <w:numPr>
+          <w:ilvl w:val="0"/>
+          <w:numId w:val="9"/>
+        </w:numPr>
+      </w:pPr>
+      <w:r>
+        <w:rPr>
+          <w:b/>
+          <w:bCs/>
+        </w:rPr>
+        <w:t>Relación</w:t>
+      </w:r>
+      <w:r>
+        <w:t>: Ambos archivos se combinan en tiempo de ejecución para formar una sola clase que genera la respuesta HTTP.</w:t>
+      </w:r>
+    </w:p>
+    <w:p/>
     <w:p/>
     <w:p/>
     <w:p/>
@@ -2251,6 +1904,155 @@
     </w:lvl>
   </w:abstractNum>
   <w:abstractNum w:abstractNumId="7" w15:restartNumberingAfterBreak="0">
+    <w:nsid w:val="756C70AD"/>
+    <w:multiLevelType w:val="multilevel"/>
+    <w:tmpl w:val="BA4EC212"/>
+    <w:lvl w:ilvl="0">
+      <w:start w:val="1"/>
+      <w:numFmt w:val="bullet"/>
+      <w:lvlText w:val=""/>
+      <w:lvlJc w:val="left"/>
+      <w:pPr>
+        <w:tabs>
+          <w:tab w:val="num" w:pos="720"/>
+        </w:tabs>
+        <w:ind w:left="720" w:hanging="360"/>
+      </w:pPr>
+      <w:rPr>
+        <w:rFonts w:ascii="Symbol" w:hAnsi="Symbol" w:hint="default"/>
+        <w:sz w:val="20"/>
+      </w:rPr>
+    </w:lvl>
+    <w:lvl w:ilvl="1" w:tentative="1">
+      <w:start w:val="1"/>
+      <w:numFmt w:val="bullet"/>
+      <w:lvlText w:val="o"/>
+      <w:lvlJc w:val="left"/>
+      <w:pPr>
+        <w:tabs>
+          <w:tab w:val="num" w:pos="1440"/>
+        </w:tabs>
+        <w:ind w:left="1440" w:hanging="360"/>
+      </w:pPr>
+      <w:rPr>
+        <w:rFonts w:ascii="Courier New" w:hAnsi="Courier New" w:hint="default"/>
+        <w:sz w:val="20"/>
+      </w:rPr>
+    </w:lvl>
+    <w:lvl w:ilvl="2" w:tentative="1">
+      <w:start w:val="1"/>
+      <w:numFmt w:val="bullet"/>
+      <w:lvlText w:val=""/>
+      <w:lvlJc w:val="left"/>
+      <w:pPr>
+        <w:tabs>
+          <w:tab w:val="num" w:pos="2160"/>
+        </w:tabs>
+        <w:ind w:left="2160" w:hanging="360"/>
+      </w:pPr>
+      <w:rPr>
+        <w:rFonts w:ascii="Wingdings" w:hAnsi="Wingdings" w:hint="default"/>
+        <w:sz w:val="20"/>
+      </w:rPr>
+    </w:lvl>
+    <w:lvl w:ilvl="3" w:tentative="1">
+      <w:start w:val="1"/>
+      <w:numFmt w:val="bullet"/>
+      <w:lvlText w:val=""/>
+      <w:lvlJc w:val="left"/>
+      <w:pPr>
+        <w:tabs>
+          <w:tab w:val="num" w:pos="2880"/>
+        </w:tabs>
+        <w:ind w:left="2880" w:hanging="360"/>
+      </w:pPr>
+      <w:rPr>
+        <w:rFonts w:ascii="Wingdings" w:hAnsi="Wingdings" w:hint="default"/>
+        <w:sz w:val="20"/>
+      </w:rPr>
+    </w:lvl>
+    <w:lvl w:ilvl="4" w:tentative="1">
+      <w:start w:val="1"/>
+      <w:numFmt w:val="bullet"/>
+      <w:lvlText w:val=""/>
+      <w:lvlJc w:val="left"/>
+      <w:pPr>
+        <w:tabs>
+          <w:tab w:val="num" w:pos="3600"/>
+        </w:tabs>
+        <w:ind w:left="3600" w:hanging="360"/>
+      </w:pPr>
+      <w:rPr>
+        <w:rFonts w:ascii="Wingdings" w:hAnsi="Wingdings" w:hint="default"/>
+        <w:sz w:val="20"/>
+      </w:rPr>
+    </w:lvl>
+    <w:lvl w:ilvl="5" w:tentative="1">
+      <w:start w:val="1"/>
+      <w:numFmt w:val="bullet"/>
+      <w:lvlText w:val=""/>
+      <w:lvlJc w:val="left"/>
+      <w:pPr>
+        <w:tabs>
+          <w:tab w:val="num" w:pos="4320"/>
+        </w:tabs>
+        <w:ind w:left="4320" w:hanging="360"/>
+      </w:pPr>
+      <w:rPr>
+        <w:rFonts w:ascii="Wingdings" w:hAnsi="Wingdings" w:hint="default"/>
+        <w:sz w:val="20"/>
+      </w:rPr>
+    </w:lvl>
+    <w:lvl w:ilvl="6" w:tentative="1">
+      <w:start w:val="1"/>
+      <w:numFmt w:val="bullet"/>
+      <w:lvlText w:val=""/>
+      <w:lvlJc w:val="left"/>
+      <w:pPr>
+        <w:tabs>
+          <w:tab w:val="num" w:pos="5040"/>
+        </w:tabs>
+        <w:ind w:left="5040" w:hanging="360"/>
+      </w:pPr>
+      <w:rPr>
+        <w:rFonts w:ascii="Wingdings" w:hAnsi="Wingdings" w:hint="default"/>
+        <w:sz w:val="20"/>
+      </w:rPr>
+    </w:lvl>
+    <w:lvl w:ilvl="7" w:tentative="1">
+      <w:start w:val="1"/>
+      <w:numFmt w:val="bullet"/>
+      <w:lvlText w:val=""/>
+      <w:lvlJc w:val="left"/>
+      <w:pPr>
+        <w:tabs>
+          <w:tab w:val="num" w:pos="5760"/>
+        </w:tabs>
+        <w:ind w:left="5760" w:hanging="360"/>
+      </w:pPr>
+      <w:rPr>
+        <w:rFonts w:ascii="Wingdings" w:hAnsi="Wingdings" w:hint="default"/>
+        <w:sz w:val="20"/>
+      </w:rPr>
+    </w:lvl>
+    <w:lvl w:ilvl="8" w:tentative="1">
+      <w:start w:val="1"/>
+      <w:numFmt w:val="bullet"/>
+      <w:lvlText w:val=""/>
+      <w:lvlJc w:val="left"/>
+      <w:pPr>
+        <w:tabs>
+          <w:tab w:val="num" w:pos="6480"/>
+        </w:tabs>
+        <w:ind w:left="6480" w:hanging="360"/>
+      </w:pPr>
+      <w:rPr>
+        <w:rFonts w:ascii="Wingdings" w:hAnsi="Wingdings" w:hint="default"/>
+        <w:sz w:val="20"/>
+      </w:rPr>
+    </w:lvl>
+  </w:abstractNum>
+  <w:abstractNum w:abstractNumId="8" w15:restartNumberingAfterBreak="0">
     <w:nsid w:val="7EC64DBB"/>
     <w:multiLevelType w:val="multilevel"/>
     <w:tmpl w:val="7D906226"/>
@@ -2415,13 +2217,16 @@
     <w:abstractNumId w:val="5"/>
   </w:num>
   <w:num w:numId="6" w16cid:durableId="1691831381">
-    <w:abstractNumId w:val="7"/>
+    <w:abstractNumId w:val="8"/>
   </w:num>
   <w:num w:numId="7" w16cid:durableId="677463161">
     <w:abstractNumId w:val="2"/>
   </w:num>
   <w:num w:numId="8" w16cid:durableId="1571772407">
     <w:abstractNumId w:val="0"/>
+  </w:num>
+  <w:num w:numId="9" w16cid:durableId="1399784425">
+    <w:abstractNumId w:val="7"/>
   </w:num>
 </w:numbering>
 </file>

</xml_diff>